<commit_message>
Reporte Word: tipo de estudio en lista, época según campaña y pendientes en amarillo
- Tipo de estudio como lista desplegable (con opción "Otro").
- La época se muestra según la temporada de la campaña, sin editar.
- Se quita la elección de categorías: se usan CR, EN y VU según la región
  del proyecto (igual que el Excel) y se muestra el conteo en el resumen.
- Lo que queda por completar ([Completar…], [Insertar…]) sale destacado en
  amarillo en el Word.
- Flora: "en el marco de la/del" según el tipo de estudio.

Co-Authored-By: Claude Opus 5.5 <noreply@anthropic.com>
</commit_message>
<xml_diff>
--- a/public/plantillas/reporte-flora.docx
+++ b/public/plantillas/reporte-flora.docx
@@ -204,14 +204,14 @@
         <w:t xml:space="preserve">{anio}</w:t>
       </w:r>
       <w:r>
-        <w:t xml:space="preserve">, en el marco del </w:t>
+        <w:t xml:space="preserve">, en el marco {delTipoEstudio}</w:t>
       </w:r>
       <w:r>
         <w:rPr>
           <w:b w:val="0"/>
           <w:i w:val="0"/>
         </w:rPr>
-        <w:t xml:space="preserve">{tipoEstudio}</w:t>
+        <w:t xml:space="preserve"/>
       </w:r>
       <w:r>
         <w:t xml:space="preserve"> del proyecto </w:t>

</xml_diff>